<commit_message>
data and preprint updated
following the authors' reply on pubpeer and their correction of the discrepencies in the N listed for Zemestani 2020
</commit_message>
<xml_diff>
--- a/communciations/preprint/Hussey & Elson - 2025 - Verification of Zhao et al. (2023).docx
+++ b/communciations/preprint/Hussey & Elson - 2025 - Verification of Zhao et al. (2023).docx
@@ -158,14 +158,7 @@
           <w:sz w:val="28"/>
           <w:szCs w:val="28"/>
         </w:rPr>
-        <w:t xml:space="preserve"> &amp; Malte Elson</w:t>
-      </w:r>
-      <w:r>
-        <w:rPr>
-          <w:sz w:val="28"/>
-          <w:szCs w:val="28"/>
-        </w:rPr>
-        <w:t xml:space="preserve"> </w:t>
+        <w:t xml:space="preserve"> &amp; Malte Elson </w:t>
       </w:r>
     </w:p>
     <w:p>
@@ -341,14 +334,111 @@
           <w:sz w:val="22"/>
           <w:szCs w:val="22"/>
         </w:rPr>
-        <w:t xml:space="preserve"> = 0.68 was 35% smaller than that reported in the original meta-analysis.</w:t>
+        <w:t xml:space="preserve"> = 0.6</w:t>
       </w:r>
       <w:r>
         <w:rPr>
           <w:sz w:val="22"/>
           <w:szCs w:val="22"/>
         </w:rPr>
-        <w:t xml:space="preserve"> The results of other subgroup meta-analyses reported by Zhao et al. (2023) are likely also to be affected</w:t>
+        <w:t>1</w:t>
+      </w:r>
+      <w:r>
+        <w:rPr>
+          <w:sz w:val="22"/>
+          <w:szCs w:val="22"/>
+        </w:rPr>
+        <w:t xml:space="preserve"> was </w:t>
+      </w:r>
+      <w:r>
+        <w:rPr>
+          <w:sz w:val="22"/>
+          <w:szCs w:val="22"/>
+        </w:rPr>
+        <w:t>42</w:t>
+      </w:r>
+      <w:r>
+        <w:rPr>
+          <w:sz w:val="22"/>
+          <w:szCs w:val="22"/>
+        </w:rPr>
+        <w:t>% smaller than that reported in the original meta-analysis.</w:t>
+      </w:r>
+      <w:r>
+        <w:rPr>
+          <w:sz w:val="22"/>
+          <w:szCs w:val="22"/>
+        </w:rPr>
+        <w:t xml:space="preserve"> </w:t>
+      </w:r>
+      <w:r>
+        <w:rPr>
+          <w:sz w:val="22"/>
+          <w:szCs w:val="22"/>
+        </w:rPr>
+        <w:t>The addition of a method to correct for publication bias (</w:t>
+      </w:r>
+      <w:proofErr w:type="spellStart"/>
+      <w:r>
+        <w:rPr>
+          <w:sz w:val="22"/>
+          <w:szCs w:val="22"/>
+        </w:rPr>
+        <w:t>RoBMA</w:t>
+      </w:r>
+      <w:proofErr w:type="spellEnd"/>
+      <w:r>
+        <w:rPr>
+          <w:sz w:val="22"/>
+          <w:szCs w:val="22"/>
+        </w:rPr>
+        <w:t>) returned an effect not detectable different from zero (</w:t>
+      </w:r>
+      <w:r>
+        <w:rPr>
+          <w:i/>
+          <w:iCs/>
+          <w:sz w:val="22"/>
+          <w:szCs w:val="22"/>
+        </w:rPr>
+        <w:t>g</w:t>
+      </w:r>
+      <w:r>
+        <w:rPr>
+          <w:sz w:val="22"/>
+          <w:szCs w:val="22"/>
+        </w:rPr>
+        <w:t xml:space="preserve"> = -0.29), 72% smaller than the </w:t>
+      </w:r>
+      <w:proofErr w:type="spellStart"/>
+      <w:r>
+        <w:rPr>
+          <w:sz w:val="22"/>
+          <w:szCs w:val="22"/>
+        </w:rPr>
+        <w:t>original.</w:t>
+      </w:r>
+      <w:r>
+        <w:rPr>
+          <w:sz w:val="22"/>
+          <w:szCs w:val="22"/>
+        </w:rPr>
+        <w:t xml:space="preserve"> </w:t>
+      </w:r>
+      <w:r>
+        <w:rPr>
+          <w:sz w:val="22"/>
+          <w:szCs w:val="22"/>
+        </w:rPr>
+        <w:t>Th</w:t>
+      </w:r>
+      <w:proofErr w:type="spellEnd"/>
+      <w:r>
+        <w:rPr>
+          <w:sz w:val="22"/>
+          <w:szCs w:val="22"/>
+        </w:rPr>
+        <w:t>e results of other subgroup meta-analyses reported by Zhao et al. (2023) are likely also to be affected</w:t>
       </w:r>
       <w:r>
         <w:rPr>
@@ -608,10 +698,10 @@
         <w:t xml:space="preserve">. </w:t>
       </w:r>
       <w:r>
-        <w:t xml:space="preserve">These errors are not random but often take common and preventable </w:t>
-      </w:r>
-      <w:r>
-        <w:t xml:space="preserve">forms </w:t>
+        <w:t xml:space="preserve">These errors are not </w:t>
+      </w:r>
+      <w:r>
+        <w:t xml:space="preserve">random but often take common and preventable forms </w:t>
       </w:r>
       <w:r>
         <w:fldChar w:fldCharType="begin"/>
@@ -664,51 +754,10 @@
       </w:r>
       <w:r>
         <w:t xml:space="preserve"> from Standard Errors (SE) instead of Standard Deviations (SD), thereby greatly inflating the effect size estimate and distorting the meta-analytic effect size.</w:t>
-      </w:r>
-    </w:p>
-    <w:p>
-      <w:r>
-        <w:t xml:space="preserve">Recently, the concept of the Verification Report has been introduced </w:t>
-      </w:r>
-      <w:r>
-        <w:fldChar w:fldCharType="begin"/>
-      </w:r>
-      <w:r>
-        <w:instrText xml:space="preserve"> ADDIN ZOTERO_ITEM CSL_CITATION {"citationID":"uMWgO4Ow","properties":{"formattedCitation":"(Chambers, 2020)","plainCitation":"(Chambers, 2020)","noteIndex":0},"citationItems":[{"id":5318,"uris":["http://zotero.org/users/1687755/items/ZD3C7VR5"],"itemData":{"id":5318,"type":"article-journal","container-title":"Cortex; a Journal Devoted to the Study of the Nervous System and Behavior","DOI":"10.1016/j.cortex.2020.04.020","ISSN":"1973-8102","journalAbbreviation":"Cortex","language":"eng","note":"PMID: 32563516","page":"A1-A3","source":"PubMed","title":"Verification Reports: A new article type at Cortex","title-short":"Verification Reports","volume":"129","author":[{"family":"Chambers","given":"Christopher D."}],"issued":{"date-parts":[["2020",8]]}}}],"schema":"https://github.com/citation-style-language/schema/raw/master/csl-citation.json"} </w:instrText>
-      </w:r>
-      <w:r>
-        <w:fldChar w:fldCharType="separate"/>
-      </w:r>
-      <w:r>
-        <w:t>(Chambers, 2020)</w:t>
-      </w:r>
-      <w:r>
-        <w:fldChar w:fldCharType="end"/>
-      </w:r>
-      <w:r>
-        <w:t xml:space="preserve">: articles whose primary goal is to verify the analyses reported in previous research so as to assess the </w:t>
-      </w:r>
-      <w:r>
-        <w:t>accuracy</w:t>
-      </w:r>
-      <w:r>
-        <w:t xml:space="preserve">, robustness, and </w:t>
-      </w:r>
-      <w:r>
-        <w:t>credibility</w:t>
-      </w:r>
-      <w:r>
-        <w:t xml:space="preserve"> of that work. Given the importance of meta-analyses for assessing the efficacy of psychotherapy, and at the same time the strong a priori probability that such meta-analyses contain errors, I therefore sought to verify some of the key analyses reported by Zhao et al. (2023). </w:t>
       </w:r>
     </w:p>
     <w:p>
       <w:pPr>
-        <w:spacing w:line="276" w:lineRule="auto"/>
-        <w:ind w:firstLine="0"/>
-        <w:rPr>
-          <w:b/>
-          <w:bCs/>
-        </w:rPr>
         <w:sectPr>
           <w:type w:val="continuous"/>
           <w:pgSz w:w="11906" w:h="16838"/>
@@ -718,22 +767,38 @@
           <w15:footnoteColumns w:val="1"/>
         </w:sectPr>
       </w:pPr>
-    </w:p>
-    <w:p>
-      <w:pPr>
-        <w:spacing w:line="480" w:lineRule="auto"/>
-        <w:ind w:firstLine="720"/>
-        <w:rPr>
-          <w:b/>
-          <w:bCs/>
-        </w:rPr>
-      </w:pPr>
-      <w:r>
-        <w:rPr>
-          <w:b/>
-          <w:bCs/>
-        </w:rPr>
-        <w:br w:type="page"/>
+      <w:r>
+        <w:t xml:space="preserve">Recently, the concept of the Verification Report has been introduced </w:t>
+      </w:r>
+      <w:r>
+        <w:fldChar w:fldCharType="begin"/>
+      </w:r>
+      <w:r>
+        <w:instrText xml:space="preserve"> ADDIN ZOTERO_ITEM CSL_CITATION {"citationID":"uMWgO4Ow","properties":{"formattedCitation":"(Chambers, 2020)","plainCitation":"(Chambers, 2020)","noteIndex":0},"citationItems":[{"id":5318,"uris":["http://zotero.org/users/1687755/items/ZD3C7VR5"],"itemData":{"id":5318,"type":"article-journal","container-title":"Cortex; a Journal Devoted to the Study of the Nervous System and Behavior","DOI":"10.1016/j.cortex.2020.04.020","ISSN":"1973-8102","journalAbbreviation":"Cortex","language":"eng","note":"PMID: 32563516","page":"A1-A3","source":"PubMed","title":"Verification Reports: A new article type at Cortex","title-short":"Verification Reports","volume":"129","author":[{"family":"Chambers","given":"Christopher D."}],"issued":{"date-parts":[["2020",8]]}}}],"schema":"https://github.com/citation-style-language/schema/raw/master/csl-citation.json"} </w:instrText>
+      </w:r>
+      <w:r>
+        <w:fldChar w:fldCharType="separate"/>
+      </w:r>
+      <w:r>
+        <w:t>(Chambers, 2020)</w:t>
+      </w:r>
+      <w:r>
+        <w:fldChar w:fldCharType="end"/>
+      </w:r>
+      <w:r>
+        <w:t xml:space="preserve">: articles whose primary goal is to verify the analyses reported in previous research so as to assess the </w:t>
+      </w:r>
+      <w:r>
+        <w:t>accuracy</w:t>
+      </w:r>
+      <w:r>
+        <w:t xml:space="preserve">, robustness, and </w:t>
+      </w:r>
+      <w:r>
+        <w:t>credibility</w:t>
+      </w:r>
+      <w:r>
+        <w:t xml:space="preserve"> of that work. Given the importance of meta-analyses for assessing the efficacy of psychotherapy, and at the same time the strong a priori probability that such meta-analyses contain errors, I therefore sought to verify some of the key analyses reported by Zhao et al. (2023). </w:t>
       </w:r>
     </w:p>
     <w:p>
@@ -1516,23 +1581,7 @@
                 <w:sz w:val="16"/>
                 <w:szCs w:val="16"/>
               </w:rPr>
-              <w:t xml:space="preserve">Situ </w:t>
-            </w:r>
-            <w:proofErr w:type="spellStart"/>
-            <w:r>
-              <w:rPr>
-                <w:sz w:val="16"/>
-                <w:szCs w:val="16"/>
-              </w:rPr>
-              <w:t>Yuyi</w:t>
-            </w:r>
-            <w:proofErr w:type="spellEnd"/>
-            <w:r>
-              <w:rPr>
-                <w:sz w:val="16"/>
-                <w:szCs w:val="16"/>
-              </w:rPr>
-              <w:t xml:space="preserve"> 2022</w:t>
+              <w:t>Situ Yuyi 2022</w:t>
             </w:r>
           </w:p>
         </w:tc>
@@ -2139,23 +2188,7 @@
                 <w:sz w:val="16"/>
                 <w:szCs w:val="16"/>
               </w:rPr>
-              <w:t xml:space="preserve">Ren </w:t>
-            </w:r>
-            <w:proofErr w:type="spellStart"/>
-            <w:r>
-              <w:rPr>
-                <w:sz w:val="16"/>
-                <w:szCs w:val="16"/>
-              </w:rPr>
-              <w:t>Zhihong</w:t>
-            </w:r>
-            <w:proofErr w:type="spellEnd"/>
-            <w:r>
-              <w:rPr>
-                <w:sz w:val="16"/>
-                <w:szCs w:val="16"/>
-              </w:rPr>
-              <w:t xml:space="preserve"> 2012</w:t>
+              <w:t>Ren Zhihong 2012</w:t>
             </w:r>
           </w:p>
         </w:tc>
@@ -3036,21 +3069,12 @@
                 <w:szCs w:val="16"/>
               </w:rPr>
             </w:pPr>
-            <w:proofErr w:type="spellStart"/>
-            <w:r>
-              <w:rPr>
-                <w:sz w:val="16"/>
-                <w:szCs w:val="16"/>
-              </w:rPr>
-              <w:t>Lappalainen</w:t>
-            </w:r>
-            <w:proofErr w:type="spellEnd"/>
-            <w:r>
-              <w:rPr>
-                <w:sz w:val="16"/>
-                <w:szCs w:val="16"/>
-              </w:rPr>
-              <w:t xml:space="preserve"> 2015</w:t>
+            <w:r>
+              <w:rPr>
+                <w:sz w:val="16"/>
+                <w:szCs w:val="16"/>
+              </w:rPr>
+              <w:t>Lappalainen 2015</w:t>
             </w:r>
           </w:p>
         </w:tc>
@@ -5205,18 +5229,10 @@
     </w:p>
     <w:p>
       <w:r>
-        <w:t xml:space="preserve">Although the sensitivity analysis results reported in Figure 4 were substantively reproduced from the summary statistics reported in that figure, the validity of those results are reliant on the summary statistics being accurately extracted from the original studies. Recent work has shown that this is frequently not the case (e.g., </w:t>
-      </w:r>
-      <w:proofErr w:type="spellStart"/>
-      <w:r>
-        <w:t>Maassen</w:t>
-      </w:r>
-      <w:proofErr w:type="spellEnd"/>
-      <w:r>
-        <w:t xml:space="preserve"> et al., 2020). I therefore attempted </w:t>
-      </w:r>
-      <w:r>
-        <w:t>to extract the Mean, SD, and N for the ACT and control conditions at the post-intervention time point for each of the original studies</w:t>
+        <w:t xml:space="preserve">Although the sensitivity analysis results reported in Figure 4 were substantively reproduced from the summary statistics reported in that figure, the validity of those results are reliant on the summary statistics being accurately extracted from the original studies. Recent work has shown that this is frequently not the case </w:t>
+      </w:r>
+      <w:r>
+        <w:t>(e.g., Maassen et al., 2020). I therefore attempted to extract the Mean, SD, and N for the ACT and control conditions at the post-intervention time point for each of the original studies</w:t>
       </w:r>
       <w:r>
         <w:t xml:space="preserve"> and compare them against the values reported in Zhao et al. (2023)</w:t>
@@ -5238,15 +5254,7 @@
         <w:t>, SDs, and Ns for both conditions were identical for two rows: that for the studies labelled “</w:t>
       </w:r>
       <w:r>
-        <w:t xml:space="preserve">Ren </w:t>
-      </w:r>
-      <w:proofErr w:type="spellStart"/>
-      <w:r>
-        <w:t>Zhihong</w:t>
-      </w:r>
-      <w:proofErr w:type="spellEnd"/>
-      <w:r>
-        <w:t xml:space="preserve"> 2012</w:t>
+        <w:t>Ren Zhihong 2012</w:t>
       </w:r>
       <w:r>
         <w:t>” and “</w:t>
@@ -5350,7 +5358,19 @@
     </w:p>
     <w:p>
       <w:r>
-        <w:t>In 3 of the remaining 8 articles (37.5%), the summary statistics (M, SD, or N) reported in Zhao et al. (2023, Figure 4) did not match those re</w:t>
+        <w:t xml:space="preserve">In </w:t>
+      </w:r>
+      <w:r>
+        <w:t>2</w:t>
+      </w:r>
+      <w:r>
+        <w:t xml:space="preserve"> of the remaining 8 articles (</w:t>
+      </w:r>
+      <w:r>
+        <w:t>2</w:t>
+      </w:r>
+      <w:r>
+        <w:t>5%), the summary statistics (M, SD, or N) reported in Zhao et al. (2023, Figure 4) did not match those re</w:t>
       </w:r>
       <w:r>
         <w:t>-</w:t>
@@ -5392,27 +5412,11 @@
         <w:fldChar w:fldCharType="end"/>
       </w:r>
       <w:r>
-        <w:t xml:space="preserve">, and is problematic as SEs are much smaller than SDs which inflates the calculated Standardized Mean Difference effect sizes. In the remaining case </w:t>
-      </w:r>
-      <w:r>
-        <w:fldChar w:fldCharType="begin"/>
-      </w:r>
-      <w:r>
-        <w:instrText xml:space="preserve"> ADDIN ZOTERO_ITEM CSL_CITATION {"citationID":"8U2t9er8","properties":{"formattedCitation":"(Zemestani &amp; Mozaffari, 2020)","plainCitation":"(Zemestani &amp; Mozaffari, 2020)","noteIndex":0},"citationItems":[{"id":15279,"uris":["http://zotero.org/users/1687755/items/HPBECZPI"],"itemData":{"id":15279,"type":"article-journal","abstract":"Objective: To evaluate the effectiveness of acceptance and commitment therapy (ACT) on depressive symptoms in physically disabled persons.\nDesign: Randomized controlled trial.\nSetting: State welfare organization in Kamyaran, Kurdistan, Iran.\nParticipants: Fifty-two physically disabled participants with a primary diagnosis of depression were randomly assigned to either ACT or control groups.\nInterventions: Participants in the ACT group (n = 23) received eight weekly 90-minute group sessions based on standard ACT protocol for depression. Participants in the control group (n = 29) received psychoeducation regarding depression.\nMain measures: Measures were recorded at baseline, eight weeks (end of treatment), and 16 weeks (follow-up). The outcomes were the change in the depressive symptoms, measured by Beck Depression Inventory-II (BDI-II), psychological flexibility, emotion regulation, and psychological well-being measured by Acceptance and Action Questionnaire-II (AAQ-II), Emotion Regulation Questionnaire (ERQ), and Scales of Psychological Well-Being (SPWB), respectively.\nResults: After eight weeks, significant changes in depressive symptoms was observed in the experimental group (ACT –10.39 ± 0.79 vs control 0.66 ± 0.68, P &lt; 0.001). Compared to the control group, the experimental group also showed significant improvement in psychological flexibility (ACT 8.13 ± 0.52 vs control –0.03 ± 0.51, P &lt; 0.001), adaptive emotion regulation strategies (ACT 10.74 ± 0.62 vs control 0.03 ± 1.03, P &lt; 0.001), and psychological well-being (ACT 66.95 ± 4.01 vs control –1.90 ± 1.04, P &lt; 0.001).\nConclusion: Compared with control group, ACT significantly reduced the participants’ depression, and changed psychological flexibility, emotion regulation, and psychological well-being in persons with physical disability.","container-title":"Clinical Rehabilitation","DOI":"10.1177/0269215520923135","ISSN":"0269-2155","issue":"7","journalAbbreviation":"Clin Rehabil","language":"en","note":"publisher: SAGE Publications Ltd STM","page":"938-947","source":"SAGE Journals","title":"Acceptance and commitment therapy for the treatment of depression in persons with physical disability: a randomized controlled trial","title-short":"Acceptance and commitment therapy for the treatment of depression in persons with physical disability","volume":"34","author":[{"family":"Zemestani","given":"Mehdi"},{"family":"Mozaffari","given":"Sharmin"}],"issued":{"date-parts":[["2020",7,1]]}}}],"schema":"https://github.com/citation-style-language/schema/raw/master/csl-citation.json"} </w:instrText>
-      </w:r>
-      <w:r>
-        <w:fldChar w:fldCharType="separate"/>
-      </w:r>
-      <w:r>
-        <w:t>(Zemestani &amp; Mozaffari, 2020)</w:t>
-      </w:r>
-      <w:r>
-        <w:fldChar w:fldCharType="end"/>
-      </w:r>
-      <w:r>
-        <w:t xml:space="preserve">, the sample sizes do not match those reported in the original publication. This also distorts SMD effect sizes, although in this case by a much </w:t>
+        <w:t xml:space="preserve">, and is problematic as SEs are much smaller than SDs which inflates the calculated Standardized Mean Difference effect sizes. </w:t>
       </w:r>
     </w:p>
+    <w:p/>
+    <w:p/>
     <w:p>
       <w:pPr>
         <w:sectPr>
@@ -6526,23 +6530,7 @@
                 <w:sz w:val="16"/>
                 <w:szCs w:val="16"/>
               </w:rPr>
-              <w:t xml:space="preserve">Situ </w:t>
-            </w:r>
-            <w:proofErr w:type="spellStart"/>
-            <w:r>
-              <w:rPr>
-                <w:sz w:val="16"/>
-                <w:szCs w:val="16"/>
-              </w:rPr>
-              <w:t>Yuyi</w:t>
-            </w:r>
-            <w:proofErr w:type="spellEnd"/>
-            <w:r>
-              <w:rPr>
-                <w:sz w:val="16"/>
-                <w:szCs w:val="16"/>
-              </w:rPr>
-              <w:t xml:space="preserve"> 2022</w:t>
+              <w:t>Situ Yuyi 2022</w:t>
             </w:r>
           </w:p>
         </w:tc>
@@ -7583,23 +7571,7 @@
                 <w:sz w:val="16"/>
                 <w:szCs w:val="16"/>
               </w:rPr>
-              <w:t xml:space="preserve">Ren </w:t>
-            </w:r>
-            <w:proofErr w:type="spellStart"/>
-            <w:r>
-              <w:rPr>
-                <w:sz w:val="16"/>
-                <w:szCs w:val="16"/>
-              </w:rPr>
-              <w:t>Zhihong</w:t>
-            </w:r>
-            <w:proofErr w:type="spellEnd"/>
-            <w:r>
-              <w:rPr>
-                <w:sz w:val="16"/>
-                <w:szCs w:val="16"/>
-              </w:rPr>
-              <w:t xml:space="preserve"> 2012</w:t>
+              <w:t>Ren Zhihong 2012</w:t>
             </w:r>
           </w:p>
         </w:tc>
@@ -8347,7 +8319,14 @@
                 <w:sz w:val="16"/>
                 <w:szCs w:val="16"/>
               </w:rPr>
-              <w:t>Inconsistent*</w:t>
+              <w:t>C</w:t>
+            </w:r>
+            <w:r>
+              <w:rPr>
+                <w:sz w:val="16"/>
+                <w:szCs w:val="16"/>
+              </w:rPr>
+              <w:t>onsistent</w:t>
             </w:r>
           </w:p>
         </w:tc>
@@ -8493,7 +8472,14 @@
                 <w:sz w:val="16"/>
                 <w:szCs w:val="16"/>
               </w:rPr>
-              <w:t>23</w:t>
+              <w:t>2</w:t>
+            </w:r>
+            <w:r>
+              <w:rPr>
+                <w:sz w:val="16"/>
+                <w:szCs w:val="16"/>
+              </w:rPr>
+              <w:t>6</w:t>
             </w:r>
           </w:p>
         </w:tc>
@@ -8574,7 +8560,7 @@
                 <w:sz w:val="16"/>
                 <w:szCs w:val="16"/>
               </w:rPr>
-              <w:t>29</w:t>
+              <w:t>30</w:t>
             </w:r>
           </w:p>
         </w:tc>
@@ -8851,7 +8837,7 @@
                 <w:sz w:val="16"/>
                 <w:szCs w:val="16"/>
               </w:rPr>
-              <w:t>Inconsistent**</w:t>
+              <w:t>Inconsistent*</w:t>
             </w:r>
           </w:p>
         </w:tc>
@@ -9138,21 +9124,12 @@
                 <w:szCs w:val="16"/>
               </w:rPr>
             </w:pPr>
-            <w:proofErr w:type="spellStart"/>
-            <w:r>
-              <w:rPr>
-                <w:sz w:val="16"/>
-                <w:szCs w:val="16"/>
-              </w:rPr>
-              <w:t>Lappalainen</w:t>
-            </w:r>
-            <w:proofErr w:type="spellEnd"/>
-            <w:r>
-              <w:rPr>
-                <w:sz w:val="16"/>
-                <w:szCs w:val="16"/>
-              </w:rPr>
-              <w:t xml:space="preserve"> 2015</w:t>
+            <w:r>
+              <w:rPr>
+                <w:sz w:val="16"/>
+                <w:szCs w:val="16"/>
+              </w:rPr>
+              <w:t>Lappalainen 2015</w:t>
             </w:r>
           </w:p>
         </w:tc>
@@ -11438,7 +11415,7 @@
                 <w:sz w:val="16"/>
                 <w:szCs w:val="16"/>
               </w:rPr>
-              <w:t>Inconsistent**</w:t>
+              <w:t>Inconsistent*</w:t>
             </w:r>
           </w:p>
         </w:tc>
@@ -11782,21 +11759,7 @@
                 <w:sz w:val="16"/>
                 <w:szCs w:val="16"/>
               </w:rPr>
-              <w:t>* Incorrectly extracted result</w:t>
-            </w:r>
-            <w:r>
-              <w:rPr>
-                <w:sz w:val="16"/>
-                <w:szCs w:val="16"/>
-              </w:rPr>
-              <w:t xml:space="preserve">. </w:t>
-            </w:r>
-            <w:r>
-              <w:rPr>
-                <w:sz w:val="16"/>
-                <w:szCs w:val="16"/>
-              </w:rPr>
-              <w:t>** Erroneously treated a Standard Error (SE) as a Standard Deviation (SD)</w:t>
+              <w:t>* Erroneously treated a Standard Error (SE) as a Standard Deviation (SD)</w:t>
             </w:r>
             <w:r>
               <w:rPr>
@@ -11836,23 +11799,7 @@
                 <w:sz w:val="16"/>
                 <w:szCs w:val="16"/>
               </w:rPr>
-              <w:t xml:space="preserve"> Zhao 2022), suggesting that the other row represents the potential error (Ren </w:t>
-            </w:r>
-            <w:proofErr w:type="spellStart"/>
-            <w:r>
-              <w:rPr>
-                <w:sz w:val="16"/>
-                <w:szCs w:val="16"/>
-              </w:rPr>
-              <w:t>Zhihong</w:t>
-            </w:r>
-            <w:proofErr w:type="spellEnd"/>
-            <w:r>
-              <w:rPr>
-                <w:sz w:val="16"/>
-                <w:szCs w:val="16"/>
-              </w:rPr>
-              <w:t xml:space="preserve"> 2012).</w:t>
+              <w:t xml:space="preserve"> Zhao 2022), suggesting that the other row represents the potential error (Ren Zhihong 2012).</w:t>
             </w:r>
           </w:p>
         </w:tc>
@@ -11882,15 +11829,13 @@
         <w:ind w:firstLine="0"/>
       </w:pPr>
       <w:r>
-        <w:t xml:space="preserve">smaller degree. In summary, only 5 of the 11 sets of summary statistics could be verified against the numbers reported in the original articles. </w:t>
-      </w:r>
-      <w:proofErr w:type="gramStart"/>
-      <w:r>
-        <w:t>Both  Zhao</w:t>
-      </w:r>
-      <w:proofErr w:type="gramEnd"/>
-      <w:r>
-        <w:t xml:space="preserve"> et al.’s (2023) summary statistics and the re-extracted summary statistics are reported in Table 2.</w:t>
+        <w:t xml:space="preserve">In summary, only </w:t>
+      </w:r>
+      <w:r>
+        <w:t>6</w:t>
+      </w:r>
+      <w:r>
+        <w:t xml:space="preserve"> of the 11 sets of summary statistics could be verified against the numbers reported in the original articles. Both Zhao et al.’s (2023) summary statistics and the re-extracted summary statistics are reported in Table 2.</w:t>
       </w:r>
     </w:p>
     <w:p>
@@ -11920,39 +11865,7 @@
       </w:r>
       <w:proofErr w:type="spellEnd"/>
       <w:r>
-        <w:t xml:space="preserve"> the original article, but original source of the identical summary statistics labelled “Ren </w:t>
-      </w:r>
-      <w:proofErr w:type="spellStart"/>
-      <w:r>
-        <w:t>Zhihong</w:t>
-      </w:r>
-      <w:proofErr w:type="spellEnd"/>
-      <w:r>
-        <w:t xml:space="preserve"> 2012” could not be accessed, this may reasonably imply </w:t>
-      </w:r>
-      <w:proofErr w:type="gramStart"/>
-      <w:r>
-        <w:t>that  it</w:t>
-      </w:r>
-      <w:proofErr w:type="gramEnd"/>
-      <w:r>
-        <w:t xml:space="preserve"> is the latter set of summary statistics that are the erroneous duplicate. I therefore excluded the results </w:t>
-      </w:r>
-      <w:proofErr w:type="gramStart"/>
-      <w:r>
-        <w:t>of  “</w:t>
-      </w:r>
-      <w:proofErr w:type="gramEnd"/>
-      <w:r>
-        <w:t xml:space="preserve">Ren </w:t>
-      </w:r>
-      <w:proofErr w:type="spellStart"/>
-      <w:r>
-        <w:t>Zhihong</w:t>
-      </w:r>
-      <w:proofErr w:type="spellEnd"/>
-      <w:r>
-        <w:t xml:space="preserve"> 2012” from all subsequent analyses.</w:t>
+        <w:t xml:space="preserve"> the original article, but original source of the identical summary statistics labelled “Ren Zhihong 2012” could not be accessed, this may reasonably imply that it is the latter set of summary statistics that are the erroneous duplicate. I therefore excluded the results of “Ren Zhihong 2012” from all subsequent analyses.</w:t>
       </w:r>
     </w:p>
     <w:p>
@@ -12047,7 +11960,7 @@
         <w:t>d</w:t>
       </w:r>
       <w:r>
-        <w:t xml:space="preserve"> =  0.25) and  Zhao et al.’s (2023) extracted effect size (</w:t>
+        <w:t xml:space="preserve"> = 0.25) and Zhao et al.’s (2023) extracted effect size (</w:t>
       </w:r>
       <w:r>
         <w:rPr>
@@ -12129,10 +12042,10 @@
           <w:noProof/>
         </w:rPr>
         <w:drawing>
-          <wp:inline distT="0" distB="0" distL="0" distR="0" wp14:anchorId="7F13DF2E" wp14:editId="209512E8">
-            <wp:extent cx="4652211" cy="2990486"/>
+          <wp:inline distT="0" distB="0" distL="0" distR="0" wp14:anchorId="1409CBC7" wp14:editId="73A00F10">
+            <wp:extent cx="4790003" cy="3079060"/>
             <wp:effectExtent l="0" t="0" r="0" b="0"/>
-            <wp:docPr id="1914247399" name="Picture 2" descr="A graph with different colored lines&#10;&#10;AI-generated content may be incorrect."/>
+            <wp:docPr id="2127270404" name="Picture 1" descr="A graph with different colored lines&#10;&#10;AI-generated content may be incorrect."/>
             <wp:cNvGraphicFramePr>
               <a:graphicFrameLocks xmlns:a="http://schemas.openxmlformats.org/drawingml/2006/main" noChangeAspect="1"/>
             </wp:cNvGraphicFramePr>
@@ -12140,7 +12053,7 @@
               <a:graphicData uri="http://schemas.openxmlformats.org/drawingml/2006/picture">
                 <pic:pic xmlns:pic="http://schemas.openxmlformats.org/drawingml/2006/picture">
                   <pic:nvPicPr>
-                    <pic:cNvPr id="1914247399" name="Picture 2" descr="A graph with different colored lines&#10;&#10;AI-generated content may be incorrect."/>
+                    <pic:cNvPr id="2127270404" name="Picture 1" descr="A graph with different colored lines&#10;&#10;AI-generated content may be incorrect."/>
                     <pic:cNvPicPr/>
                   </pic:nvPicPr>
                   <pic:blipFill>
@@ -12158,7 +12071,7 @@
                   <pic:spPr>
                     <a:xfrm>
                       <a:off x="0" y="0"/>
-                      <a:ext cx="4706612" cy="3025455"/>
+                      <a:ext cx="4817558" cy="3096772"/>
                     </a:xfrm>
                     <a:prstGeom prst="rect">
                       <a:avLst/>
@@ -12993,23 +12906,7 @@
                 <w:sz w:val="16"/>
                 <w:szCs w:val="16"/>
               </w:rPr>
-              <w:t xml:space="preserve">Situ </w:t>
-            </w:r>
-            <w:proofErr w:type="spellStart"/>
-            <w:r>
-              <w:rPr>
-                <w:sz w:val="16"/>
-                <w:szCs w:val="16"/>
-              </w:rPr>
-              <w:t>Yuyi</w:t>
-            </w:r>
-            <w:proofErr w:type="spellEnd"/>
-            <w:r>
-              <w:rPr>
-                <w:sz w:val="16"/>
-                <w:szCs w:val="16"/>
-              </w:rPr>
-              <w:t xml:space="preserve"> 2022</w:t>
+              <w:t>Situ Yuyi 2022</w:t>
             </w:r>
           </w:p>
         </w:tc>
@@ -14260,21 +14157,12 @@
                 <w:szCs w:val="16"/>
               </w:rPr>
             </w:pPr>
-            <w:proofErr w:type="spellStart"/>
-            <w:r>
-              <w:rPr>
-                <w:sz w:val="16"/>
-                <w:szCs w:val="16"/>
-              </w:rPr>
-              <w:t>Lappalainen</w:t>
-            </w:r>
-            <w:proofErr w:type="spellEnd"/>
-            <w:r>
-              <w:rPr>
-                <w:sz w:val="16"/>
-                <w:szCs w:val="16"/>
-              </w:rPr>
-              <w:t xml:space="preserve"> 2015</w:t>
+            <w:r>
+              <w:rPr>
+                <w:sz w:val="16"/>
+                <w:szCs w:val="16"/>
+              </w:rPr>
+              <w:t>Lappalainen 2015</w:t>
             </w:r>
           </w:p>
         </w:tc>
@@ -15973,10 +15861,10 @@
           <w:noProof/>
         </w:rPr>
         <w:drawing>
-          <wp:inline distT="0" distB="0" distL="0" distR="0" wp14:anchorId="7F9368D8" wp14:editId="0E69635A">
-            <wp:extent cx="3641558" cy="1978931"/>
-            <wp:effectExtent l="0" t="0" r="3810" b="2540"/>
-            <wp:docPr id="753595438" name="Picture 1" descr="A graph with numbers and a line&#10;&#10;AI-generated content may be incorrect."/>
+          <wp:inline distT="0" distB="0" distL="0" distR="0" wp14:anchorId="305CE239" wp14:editId="416FA880">
+            <wp:extent cx="3681822" cy="2000813"/>
+            <wp:effectExtent l="0" t="0" r="1270" b="6350"/>
+            <wp:docPr id="1591885337" name="Picture 2" descr="A graph with numbers and a line&#10;&#10;AI-generated content may be incorrect."/>
             <wp:cNvGraphicFramePr>
               <a:graphicFrameLocks xmlns:a="http://schemas.openxmlformats.org/drawingml/2006/main" noChangeAspect="1"/>
             </wp:cNvGraphicFramePr>
@@ -15984,7 +15872,7 @@
               <a:graphicData uri="http://schemas.openxmlformats.org/drawingml/2006/picture">
                 <pic:pic xmlns:pic="http://schemas.openxmlformats.org/drawingml/2006/picture">
                   <pic:nvPicPr>
-                    <pic:cNvPr id="753595438" name="Picture 1" descr="A graph with numbers and a line&#10;&#10;AI-generated content may be incorrect."/>
+                    <pic:cNvPr id="1591885337" name="Picture 2" descr="A graph with numbers and a line&#10;&#10;AI-generated content may be incorrect."/>
                     <pic:cNvPicPr/>
                   </pic:nvPicPr>
                   <pic:blipFill>
@@ -16002,7 +15890,7 @@
                   <pic:spPr>
                     <a:xfrm>
                       <a:off x="0" y="0"/>
-                      <a:ext cx="3761864" cy="2044309"/>
+                      <a:ext cx="3755250" cy="2040716"/>
                     </a:xfrm>
                     <a:prstGeom prst="rect">
                       <a:avLst/>
@@ -16079,15 +15967,7 @@
         <w:t xml:space="preserve">, after excluding the apparently duplicate results from </w:t>
       </w:r>
       <w:r>
-        <w:t xml:space="preserve">Ren </w:t>
-      </w:r>
-      <w:proofErr w:type="spellStart"/>
-      <w:r>
-        <w:t>Zhihong</w:t>
-      </w:r>
-      <w:proofErr w:type="spellEnd"/>
-      <w:r>
-        <w:t xml:space="preserve"> 2012</w:t>
+        <w:t>Ren Zhihong 2012</w:t>
       </w:r>
       <w:r>
         <w:t>. The re</w:t>
@@ -16286,15 +16166,7 @@
       </w:r>
       <w:proofErr w:type="spellEnd"/>
       <w:r>
-        <w:t xml:space="preserve"> &amp; </w:t>
-      </w:r>
-      <w:proofErr w:type="spellStart"/>
-      <w:r>
-        <w:t>Mozaffari</w:t>
-      </w:r>
-      <w:proofErr w:type="spellEnd"/>
-      <w:r>
-        <w:t xml:space="preserve"> (2020) was flagged as an outlier</w:t>
+        <w:t xml:space="preserve"> &amp; Mozaffari (2020) was flagged as an outlier</w:t>
       </w:r>
       <w:r>
         <w:t xml:space="preserve">, and therefore excluded from the sensitivity analysis. </w:t>
@@ -16338,13 +16210,8 @@
         <w:t xml:space="preserve"> </w:t>
       </w:r>
       <w:r>
-        <w:t xml:space="preserve">&amp; </w:t>
-      </w:r>
-      <w:proofErr w:type="spellStart"/>
-      <w:r>
-        <w:t>Mozaffari</w:t>
-      </w:r>
-      <w:proofErr w:type="spellEnd"/>
+        <w:t>&amp; Mozaffari</w:t>
+      </w:r>
       <w:r>
         <w:t xml:space="preserve"> (2020)</w:t>
       </w:r>
@@ -16544,15 +16411,7 @@
       </w:r>
       <w:proofErr w:type="spellEnd"/>
       <w:r>
-        <w:t xml:space="preserve"> &amp; </w:t>
-      </w:r>
-      <w:proofErr w:type="spellStart"/>
-      <w:r>
-        <w:t>Mozaffari</w:t>
-      </w:r>
-      <w:proofErr w:type="spellEnd"/>
-      <w:r>
-        <w:t xml:space="preserve"> (2020) by email in October 2023 and </w:t>
+        <w:t xml:space="preserve"> &amp; Mozaffari (2020) by email in October 2023 and </w:t>
       </w:r>
       <w:r>
         <w:t>January</w:t>
@@ -16908,70 +16767,218 @@
         <w:pStyle w:val="Heading1"/>
       </w:pPr>
       <w:r>
-        <w:t xml:space="preserve">Discussion </w:t>
+        <w:t>Correction for bias</w:t>
       </w:r>
     </w:p>
     <w:p>
-      <w:r>
-        <w:t>The results of Zhao et al.’s (2023) meta-analyses appear to be based on erroneously extracted and miscalculated summary statistics that follow common patterns of error in the meta-analysis literature</w:t>
-      </w:r>
-      <w:r>
-        <w:t xml:space="preserve"> such as confusing Standard Errors (SE) for Standard Deviations </w:t>
+      <w:pPr>
+        <w:rPr>
+          <w:lang w:val="en-CH"/>
+        </w:rPr>
+      </w:pPr>
+      <w:r>
+        <w:t xml:space="preserve">Zhao et al. (2023) reported a funnel plot that they described as showing “marked asymmetry” </w:t>
+      </w:r>
+      <w:r>
+        <w:t xml:space="preserve">(pp. 5-6) </w:t>
+      </w:r>
+      <w:r>
+        <w:t xml:space="preserve">but do not report any method to attempt to correct for publication bias. </w:t>
+      </w:r>
+      <w:r>
+        <w:t xml:space="preserve">While all such methods have several arguably untestable assumptions </w:t>
       </w:r>
       <w:r>
         <w:fldChar w:fldCharType="begin"/>
       </w:r>
       <w:r>
-        <w:instrText xml:space="preserve"> ADDIN ZOTERO_ITEM CSL_CITATION {"citationID":"CUVd5DMD","properties":{"formattedCitation":"(SD; see Kadlec et al., 2023)","plainCitation":"(SD; see Kadlec et al., 2023)","noteIndex":0},"citationItems":[{"id":54,"uris":["http://zotero.org/users/1687755/items/WWKVT2EA"],"itemData":{"id":54,"type":"article-journal","abstract":"Meta-analysis and meta-regression are often highly cited and may influence practice. Unfortunately, statistical errors in meta-analyses are widespread and can lead to flawed conclusions. The purpose of this article was to review common statistical errors in meta-analyses and to document their frequency in highly cited meta-analyses from strength and conditioning research.","container-title":"Sports Medicine","DOI":"10.1007/s40279-022-01766-0","ISSN":"1179-2035","issue":"2","journalAbbreviation":"Sports Med","language":"en","page":"313-325","source":"Springer Link","title":"With Great Power Comes Great Responsibility: Common Errors in Meta-Analyses and Meta-Regressions in Strength &amp; Conditioning Research","title-short":"With Great Power Comes Great Responsibility","volume":"53","author":[{"family":"Kadlec","given":"Daniel"},{"family":"Sainani","given":"Kristin L."},{"family":"Nimphius","given":"Sophia"}],"issued":{"date-parts":[["2023",2,1]]}},"label":"page","prefix":"SD; see"}],"schema":"https://github.com/citation-style-language/schema/raw/master/csl-citation.json"} </w:instrText>
+        <w:instrText xml:space="preserve"> ADDIN ZOTERO_ITEM CSL_CITATION {"citationID":"RxbVZrgu","properties":{"formattedCitation":"(e.g., Carter et al., 2019)","plainCitation":"(e.g., Carter et al., 2019)","noteIndex":0},"citationItems":[{"id":167,"uris":["http://zotero.org/users/1687755/items/KMA2ICS5"],"itemData":{"id":167,"type":"article-journal","abstract":"Publication bias and questionable research practices in primary research can lead to badly overestimated effects in meta-analysis. Methodologists have proposed a variety of statistical approaches to correct for such overestimation. However, it is not clear which methods work best for data typically seen in psychology. Here, we present a comprehensive simulation study in which we examined how some of the most promising meta-analytic methods perform on data that might realistically be produced by research in psychology. We simulated several levels of questionable research practices, publication bias, and heterogeneity, and used study sample sizes empirically derived from the literature. Our results clearly indicated that no single meta-analytic method consistently outperformed all the others. Therefore, we recommend that meta-analysts in psychology focus on sensitivity analyses?that is, report on a variety of methods, consider the conditions under which these methods fail (as indicated by simulation studies such as ours), and then report how conclusions might change depending on which conditions are most plausible. Moreover, given the dependence of meta-analytic methods on untestable assumptions, we strongly recommend that researchers in psychology continue their efforts to improve the primary literature and conduct large-scale, preregistered replications. We provide detailed results and simulation code at https://osf.io/rf3ys and interactive figures at http://www.shinyapps.org/apps/metaExplorer/.","container-title":"Advances in Methods and Practices in Psychological Science","DOI":"10.1177/2515245919847196","ISSN":"2515-2459","issue":"2","note":"publisher: SAGE Publications Inc","page":"115-144","source":"SAGE Journals","title":"Correcting for Bias in Psychology: A Comparison of Meta-Analytic Methods","title-short":"Correcting for Bias in Psychology","volume":"2","author":[{"family":"Carter","given":"Evan C."},{"family":"Schönbrodt","given":"Felix D."},{"family":"Gervais","given":"Will M."},{"family":"Hilgard","given":"Joseph"}],"issued":{"date-parts":[["2019",6,1]]}},"label":"page","prefix":"e.g., "}],"schema":"https://github.com/citation-style-language/schema/raw/master/csl-citation.json"} </w:instrText>
       </w:r>
       <w:r>
         <w:fldChar w:fldCharType="separate"/>
       </w:r>
       <w:r>
-        <w:t>(SD; see Kadlec et al., 2023)</w:t>
+        <w:rPr>
+          <w:noProof/>
+        </w:rPr>
+        <w:t>(e.g., Carter et al., 2019)</w:t>
       </w:r>
       <w:r>
         <w:fldChar w:fldCharType="end"/>
       </w:r>
       <w:r>
-        <w:t>. When the first meta-analysis they report was re-</w:t>
-      </w:r>
-      <w:r>
-        <w:t xml:space="preserve">run following Zhao et al.’s (2023) analytic strategy, the resulting meta-analytic effect size of Hedges’ </w:t>
+        <w:t xml:space="preserve">, it is perhaps useful to consider the impact of attempting to correct for bias on the results. </w:t>
+      </w:r>
+      <w:r>
+        <w:t>T</w:t>
+      </w:r>
+      <w:r>
+        <w:t xml:space="preserve">he R package </w:t>
+      </w:r>
+      <w:proofErr w:type="spellStart"/>
+      <w:r>
+        <w:t>RoBMA</w:t>
+      </w:r>
+      <w:proofErr w:type="spellEnd"/>
+      <w:r>
+        <w:t xml:space="preserve"> </w:t>
+      </w:r>
+      <w:r>
+        <w:fldChar w:fldCharType="begin"/>
+      </w:r>
+      <w:r>
+        <w:instrText xml:space="preserve"> ADDIN ZOTERO_ITEM CSL_CITATION {"citationID":"F8ZmFblp","properties":{"formattedCitation":"(Barto\\uc0\\u353{} &amp; Maier, 2020)","plainCitation":"(Bartoš &amp; Maier, 2020)","noteIndex":0},"citationItems":[{"id":32025,"uris":["http://zotero.org/users/1687755/items/7N9H6TPF"],"itemData":{"id":32025,"type":"document","title":"RoBMA: An R Package for Robust Bayesian Meta-Analyses","URL":"https://CRAN.R-project.org/package=RoBMA","author":[{"family":"Bartoš","given":"František"},{"family":"Maier","given":"Maximilian"}],"issued":{"date-parts":[["2020"]]}}}],"schema":"https://github.com/citation-style-language/schema/raw/master/csl-citation.json"} </w:instrText>
+      </w:r>
+      <w:r>
+        <w:fldChar w:fldCharType="separate"/>
+      </w:r>
+      <w:r>
+        <w:rPr>
+          <w:lang w:val="en-GB"/>
+        </w:rPr>
+        <w:t>(Bartoš &amp; Maier, 2020)</w:t>
+      </w:r>
+      <w:r>
+        <w:fldChar w:fldCharType="end"/>
+      </w:r>
+      <w:r>
+        <w:t xml:space="preserve"> </w:t>
+      </w:r>
+      <w:r>
+        <w:t xml:space="preserve">provides an ensemble method of meta-analysis models </w:t>
+      </w:r>
+      <w:r>
+        <w:t>assuming either the presence or absence of effect, heterogeneity, and publication bias and uses Bayesian model averaging to combine them</w:t>
+      </w:r>
+      <w:r>
+        <w:t>.</w:t>
+      </w:r>
+      <w:r>
+        <w:t xml:space="preserve"> Fitting the same </w:t>
+      </w:r>
+      <w:r>
+        <w:t>9</w:t>
+      </w:r>
+      <w:r>
+        <w:t xml:space="preserve"> effect sizes as in the previous analysis, </w:t>
+      </w:r>
+      <w:r>
+        <w:t xml:space="preserve">after correcting for bias, </w:t>
+      </w:r>
+      <w:r>
+        <w:t xml:space="preserve">the results of the </w:t>
+      </w:r>
+      <w:r>
+        <w:rPr>
+          <w:lang w:val="en-CH"/>
+        </w:rPr>
+        <w:t xml:space="preserve">Robust Bayesian meta-analysis </w:t>
+      </w:r>
+      <w:r>
+        <w:rPr>
+          <w:lang w:val="en-CH"/>
+        </w:rPr>
+        <w:t xml:space="preserve">did not find credible evidence of an effect size that excluded zero, </w:t>
+      </w:r>
+      <w:r>
+        <w:rPr>
+          <w:lang w:val="en-CH"/>
+        </w:rPr>
+        <w:t xml:space="preserve">mean model-averaged estimate </w:t>
+      </w:r>
+      <w:r>
+        <w:rPr>
+          <w:lang w:val="en-CH"/>
+        </w:rPr>
+        <w:t>Hedges’</w:t>
+      </w:r>
+      <w:r>
+        <w:rPr>
+          <w:lang w:val="en-CH"/>
+        </w:rPr>
+        <w:t xml:space="preserve"> </w:t>
       </w:r>
       <w:r>
         <w:rPr>
           <w:i/>
           <w:iCs/>
+          <w:lang w:val="en-CH"/>
         </w:rPr>
         <w:t>g</w:t>
       </w:r>
       <w:r>
-        <w:t xml:space="preserve"> = </w:t>
-      </w:r>
-      <w:r>
-        <w:t>-</w:t>
-      </w:r>
-      <w:r>
-        <w:t>0.6</w:t>
-      </w:r>
-      <w:r>
-        <w:t>1</w:t>
-      </w:r>
-      <w:r>
-        <w:t xml:space="preserve"> was </w:t>
-      </w:r>
-      <w:r>
-        <w:t>42.3</w:t>
-      </w:r>
-      <w:r>
-        <w:t>% smaller than that reported</w:t>
-      </w:r>
-      <w:r>
-        <w:t xml:space="preserve"> in the original meta-analysis</w:t>
-      </w:r>
-      <w:r>
-        <w:t xml:space="preserve"> (</w:t>
+        <w:rPr>
+          <w:lang w:val="en-CH"/>
+        </w:rPr>
+        <w:t xml:space="preserve"> = -0.29, 95% CI [-0.</w:t>
+      </w:r>
+      <w:r>
+        <w:rPr>
+          <w:lang w:val="en-CH"/>
+        </w:rPr>
+        <w:t>90</w:t>
+      </w:r>
+      <w:r>
+        <w:rPr>
+          <w:lang w:val="en-CH"/>
+        </w:rPr>
+        <w:t>, 0.07</w:t>
+      </w:r>
+      <w:r>
+        <w:rPr>
+          <w:lang w:val="en-CH"/>
+        </w:rPr>
+        <w:t>], BF</w:t>
+      </w:r>
+      <w:r>
+        <w:rPr>
+          <w:vertAlign w:val="subscript"/>
+          <w:lang w:val="en-CH"/>
+        </w:rPr>
+        <w:t>10</w:t>
+      </w:r>
+      <w:r>
+        <w:rPr>
+          <w:lang w:val="en-CH"/>
+        </w:rPr>
+        <w:t xml:space="preserve"> = 1.50.</w:t>
+      </w:r>
+    </w:p>
+    <w:p>
+      <w:pPr>
+        <w:pStyle w:val="Heading1"/>
+      </w:pPr>
+      <w:r>
+        <w:t xml:space="preserve">Discussion </w:t>
+      </w:r>
+    </w:p>
+    <w:p>
+      <w:r>
+        <w:t>The results of Zhao et al.’s (2023) meta-analyses appear to be based on erroneously extracted and miscalculated summary statistics that follow common patterns of error in the meta-analysis literature</w:t>
+      </w:r>
+      <w:r>
+        <w:t xml:space="preserve"> such as confusing Standard Errors (SE) for Standard Deviations </w:t>
+      </w:r>
+      <w:r>
+        <w:fldChar w:fldCharType="begin"/>
+      </w:r>
+      <w:r>
+        <w:instrText xml:space="preserve"> ADDIN ZOTERO_ITEM CSL_CITATION {"citationID":"CUVd5DMD","properties":{"formattedCitation":"(SD; see Kadlec et al., 2023)","plainCitation":"(SD; see Kadlec et al., 2023)","noteIndex":0},"citationItems":[{"id":54,"uris":["http://zotero.org/users/1687755/items/WWKVT2EA"],"itemData":{"id":54,"type":"article-journal","abstract":"Meta-analysis and meta-regression are often highly cited and may influence practice. Unfortunately, statistical errors in meta-analyses are widespread and can lead to flawed conclusions. The purpose of this article was to review common statistical errors in meta-analyses and to document their frequency in highly cited meta-analyses from strength and conditioning research.","container-title":"Sports Medicine","DOI":"10.1007/s40279-022-01766-0","ISSN":"1179-2035","issue":"2","journalAbbreviation":"Sports Med","language":"en","page":"313-325","source":"Springer Link","title":"With Great Power Comes Great Responsibility: Common Errors in Meta-Analyses and Meta-Regressions in Strength &amp; Conditioning Research","title-short":"With Great Power Comes Great Responsibility","volume":"53","author":[{"family":"Kadlec","given":"Daniel"},{"family":"Sainani","given":"Kristin L."},{"family":"Nimphius","given":"Sophia"}],"issued":{"date-parts":[["2023",2,1]]}},"label":"page","prefix":"SD; see"}],"schema":"https://github.com/citation-style-language/schema/raw/master/csl-citation.json"} </w:instrText>
+      </w:r>
+      <w:r>
+        <w:fldChar w:fldCharType="separate"/>
+      </w:r>
+      <w:r>
+        <w:t>(SD; see Kadlec et al., 2023)</w:t>
+      </w:r>
+      <w:r>
+        <w:fldChar w:fldCharType="end"/>
+      </w:r>
+      <w:r>
+        <w:t>. When the first meta-analysis they report was re-</w:t>
+      </w:r>
+      <w:r>
+        <w:t xml:space="preserve">run following Zhao et al.’s (2023) analytic strategy, the resulting meta-analytic effect size of Hedges’ </w:t>
       </w:r>
       <w:r>
         <w:rPr>
@@ -16981,12 +16988,113 @@
         <w:t>g</w:t>
       </w:r>
       <w:r>
+        <w:t xml:space="preserve"> = </w:t>
+      </w:r>
+      <w:r>
+        <w:t>-</w:t>
+      </w:r>
+      <w:r>
+        <w:t>0.6</w:t>
+      </w:r>
+      <w:r>
+        <w:t>1</w:t>
+      </w:r>
+      <w:r>
+        <w:t xml:space="preserve"> was </w:t>
+      </w:r>
+      <w:r>
+        <w:t>4</w:t>
+      </w:r>
+      <w:r>
+        <w:t>1</w:t>
+      </w:r>
+      <w:r>
+        <w:t>.</w:t>
+      </w:r>
+      <w:r>
+        <w:t>9</w:t>
+      </w:r>
+      <w:r>
+        <w:t>% smaller than that reported</w:t>
+      </w:r>
+      <w:r>
+        <w:t xml:space="preserve"> in the original meta-analysis</w:t>
+      </w:r>
+      <w:r>
+        <w:t xml:space="preserve"> (</w:t>
+      </w:r>
+      <w:r>
+        <w:rPr>
+          <w:i/>
+          <w:iCs/>
+        </w:rPr>
+        <w:t>g</w:t>
+      </w:r>
+      <w:r>
         <w:t xml:space="preserve"> = -1.05).</w:t>
+      </w:r>
+      <w:r>
+        <w:t xml:space="preserve"> The addition of a method to correct for publication bias (</w:t>
+      </w:r>
+      <w:proofErr w:type="spellStart"/>
+      <w:r>
+        <w:t>RoBMA</w:t>
+      </w:r>
+      <w:proofErr w:type="spellEnd"/>
+      <w:r>
+        <w:t xml:space="preserve">) returned an effect not detectable different from </w:t>
+      </w:r>
+      <w:r>
+        <w:t>zero</w:t>
+      </w:r>
+      <w:r>
+        <w:t xml:space="preserve"> (</w:t>
+      </w:r>
+      <w:r>
+        <w:rPr>
+          <w:i/>
+          <w:iCs/>
+          <w:lang w:val="en-CH"/>
+        </w:rPr>
+        <w:t>g</w:t>
+      </w:r>
+      <w:r>
+        <w:rPr>
+          <w:lang w:val="en-CH"/>
+        </w:rPr>
+        <w:t xml:space="preserve"> = -0.29</w:t>
+      </w:r>
+      <w:r>
+        <w:rPr>
+          <w:lang w:val="en-CH"/>
+        </w:rPr>
+        <w:t>)</w:t>
+      </w:r>
+      <w:r>
+        <w:rPr>
+          <w:lang w:val="en-CH"/>
+        </w:rPr>
+        <w:t>, 7</w:t>
+      </w:r>
+      <w:r>
+        <w:rPr>
+          <w:lang w:val="en-CH"/>
+        </w:rPr>
+        <w:t>2</w:t>
+      </w:r>
+      <w:r>
+        <w:rPr>
+          <w:lang w:val="en-CH"/>
+        </w:rPr>
+        <w:t>.4% smaller than the original.</w:t>
       </w:r>
     </w:p>
     <w:p>
       <w:r>
-        <w:t xml:space="preserve">These types of errors are both prevalent and preventable. Zhao et al. (2023) appear to have not detected them despite multiple red flags being raised: the original articles reported effect sizes that were very different from Zhao et al.’s (2023) estimates, and at least one erroneous effect size was detected as an outlier. However, neither red flag apparently prompted the authors to revisit their effect size extractions. Other warning signs were detected here, such as concerns about the veracity of the results reported for one article included in Zhao et al.’s (2023) meta-analysis. Future work may be aided by recent developments in the detection and exclusion of such problematic data, such as the INSPECT-SR tool that is in development for Cochrane reviews </w:t>
+        <w:t xml:space="preserve">These types of errors are both prevalent and preventable. Zhao et al. (2023) appear to have not detected them despite multiple red flags being raised: the original articles reported effect sizes that were very different from Zhao et al.’s (2023) estimates, and at least one erroneous effect size was detected as an outlier. However, neither red flag apparently prompted the authors to revisit their effect size extractions. Other warning signs were detected here, such as concerns about the veracity of the results reported for one article included in Zhao et al.’s (2023) meta-analysis. </w:t>
+      </w:r>
+      <w:r>
+        <w:t xml:space="preserve">Future work may be aided by recent developments in the detection and exclusion of such problematic data, such as the INSPECT-SR tool that is in development for Cochrane reviews </w:t>
       </w:r>
       <w:r>
         <w:fldChar w:fldCharType="begin"/>
@@ -17065,10 +17173,7 @@
         <w:t>p</w:t>
       </w:r>
       <w:r>
-        <w:t xml:space="preserve">-hacking or publication bias, and instead take the reported results at face value. Applying such tests typically </w:t>
-      </w:r>
-      <w:r>
-        <w:t xml:space="preserve">shrinks the estimate of the true effect </w:t>
+        <w:t xml:space="preserve">-hacking or publication bias, and instead take the reported results at face value. Applying such tests typically shrinks the estimate of the true effect </w:t>
       </w:r>
       <w:r>
         <w:fldChar w:fldCharType="begin"/>
@@ -17139,10 +17244,7 @@
         <w:t>.</w:t>
       </w:r>
       <w:r>
-        <w:t xml:space="preserve">  </w:t>
-      </w:r>
-      <w:r>
-        <w:t xml:space="preserve">Malte Elson, </w:t>
+        <w:t xml:space="preserve"> Malte Elson, </w:t>
       </w:r>
       <w:r>
         <w:t>University</w:t>
@@ -17237,27 +17339,21 @@
         <w:pStyle w:val="Bibliography"/>
       </w:pPr>
       <w:r>
-        <w:t xml:space="preserve">Brown, N. J. L., &amp; Heathers, J. A. J. (2017). The GRIM Test: A Simple Technique Detects Numerous Anomalies in the Reporting of Results in Psychology. </w:t>
+        <w:t xml:space="preserve">Bartoš, F., &amp; Maier, M. (2020). </w:t>
       </w:r>
       <w:r>
         <w:rPr>
           <w:i/>
           <w:iCs/>
         </w:rPr>
-        <w:t>Social Psychological and Personality Science</w:t>
-      </w:r>
-      <w:r>
-        <w:t xml:space="preserve">, </w:t>
-      </w:r>
-      <w:r>
-        <w:rPr>
-          <w:i/>
-          <w:iCs/>
-        </w:rPr>
-        <w:t>8</w:t>
-      </w:r>
-      <w:r>
-        <w:t>(4), 363–369. https://doi.org/10.1177/1948550616673876</w:t>
+        <w:t>RoBMA: An R Package for Robust Bayesian Meta-Analyses</w:t>
+      </w:r>
+      <w:r>
+        <w:t xml:space="preserve">. </w:t>
+      </w:r>
+      <w:r>
+        <w:lastRenderedPageBreak/>
+        <w:t>https://CRAN.R-project.org/package=RoBMA</w:t>
       </w:r>
     </w:p>
     <w:p>
@@ -17265,14 +17361,14 @@
         <w:pStyle w:val="Bibliography"/>
       </w:pPr>
       <w:r>
-        <w:t xml:space="preserve">Carter, E. C., Schönbrodt, F. D., Gervais, W. M., &amp; Hilgard, J. (2019). Correcting for Bias in Psychology: A Comparison of Meta-Analytic Methods. </w:t>
+        <w:t xml:space="preserve">Brown, N. J. L., &amp; Heathers, J. A. J. (2017). The GRIM Test: A Simple Technique Detects Numerous Anomalies in the Reporting of Results in Psychology. </w:t>
       </w:r>
       <w:r>
         <w:rPr>
           <w:i/>
           <w:iCs/>
         </w:rPr>
-        <w:t>Advances in Methods and Practices in Psychological Science</w:t>
+        <w:t>Social Psychological and Personality Science</w:t>
       </w:r>
       <w:r>
         <w:t xml:space="preserve">, </w:t>
@@ -17282,10 +17378,10 @@
           <w:i/>
           <w:iCs/>
         </w:rPr>
-        <w:t>2</w:t>
-      </w:r>
-      <w:r>
-        <w:t>(2), 115–144. https://doi.org/10.1177/2515245919847196</w:t>
+        <w:t>8</w:t>
+      </w:r>
+      <w:r>
+        <w:t>(4), 363–369. https://doi.org/10.1177/1948550616673876</w:t>
       </w:r>
     </w:p>
     <w:p>
@@ -17293,14 +17389,14 @@
         <w:pStyle w:val="Bibliography"/>
       </w:pPr>
       <w:r>
-        <w:t xml:space="preserve">Chambers, C. D. (2020). Verification Reports: A new article type at Cortex. </w:t>
+        <w:t xml:space="preserve">Carter, E. C., Schönbrodt, F. D., Gervais, W. M., &amp; Hilgard, J. (2019). Correcting for Bias in Psychology: A Comparison of Meta-Analytic Methods. </w:t>
       </w:r>
       <w:r>
         <w:rPr>
           <w:i/>
           <w:iCs/>
         </w:rPr>
-        <w:t>Cortex; a Journal Devoted to the Study of the Nervous System and Behavior</w:t>
+        <w:t>Advances in Methods and Practices in Psychological Science</w:t>
       </w:r>
       <w:r>
         <w:t xml:space="preserve">, </w:t>
@@ -17310,10 +17406,10 @@
           <w:i/>
           <w:iCs/>
         </w:rPr>
-        <w:t>129</w:t>
-      </w:r>
-      <w:r>
-        <w:t>, A1–A3. https://doi.org/10.1016/j.cortex.2020.04.020</w:t>
+        <w:t>2</w:t>
+      </w:r>
+      <w:r>
+        <w:t>(2), 115–144. https://doi.org/10.1177/2515245919847196</w:t>
       </w:r>
     </w:p>
     <w:p>
@@ -17321,14 +17417,14 @@
         <w:pStyle w:val="Bibliography"/>
       </w:pPr>
       <w:r>
-        <w:t xml:space="preserve">Chen, J., Gao, Y., Yuan, X. J., &amp; Wu, J. (2021). Analysis of the effect of acceptance and commitment therapy in the psychological nursing application of patients with depression. </w:t>
+        <w:t xml:space="preserve">Chambers, C. D. (2020). Verification Reports: A new article type at Cortex. </w:t>
       </w:r>
       <w:r>
         <w:rPr>
           <w:i/>
           <w:iCs/>
         </w:rPr>
-        <w:t>Psychology Monthly</w:t>
+        <w:t>Cortex; a Journal Devoted to the Study of the Nervous System and Behavior</w:t>
       </w:r>
       <w:r>
         <w:t xml:space="preserve">, </w:t>
@@ -17338,14 +17434,10 @@
           <w:i/>
           <w:iCs/>
         </w:rPr>
-        <w:t>16</w:t>
-      </w:r>
-      <w:r>
-        <w:t xml:space="preserve">(14), 49–50. </w:t>
-      </w:r>
-      <w:r>
-        <w:lastRenderedPageBreak/>
-        <w:t>https://doi.org/10.19738/j.cnki.psy.2021.14.020</w:t>
+        <w:t>129</w:t>
+      </w:r>
+      <w:r>
+        <w:t>, A1–A3. https://doi.org/10.1016/j.cortex.2020.04.020</w:t>
       </w:r>
     </w:p>
     <w:p>
@@ -17353,14 +17445,14 @@
         <w:pStyle w:val="Bibliography"/>
       </w:pPr>
       <w:r>
-        <w:t xml:space="preserve">Cook, R. J., &amp; Sackett, D. L. (1995). The number needed to treat: A clinically useful measure of treatment effect. </w:t>
+        <w:t xml:space="preserve">Chen, J., Gao, Y., Yuan, X. J., &amp; Wu, J. (2021). Analysis of the effect of acceptance and commitment therapy in the psychological nursing application of patients with depression. </w:t>
       </w:r>
       <w:r>
         <w:rPr>
           <w:i/>
           <w:iCs/>
         </w:rPr>
-        <w:t>BMJ : British Medical Journal</w:t>
+        <w:t>Psychology Monthly</w:t>
       </w:r>
       <w:r>
         <w:t xml:space="preserve">, </w:t>
@@ -17370,10 +17462,10 @@
           <w:i/>
           <w:iCs/>
         </w:rPr>
-        <w:t>310</w:t>
-      </w:r>
-      <w:r>
-        <w:t>(6977), 452–454.</w:t>
+        <w:t>16</w:t>
+      </w:r>
+      <w:r>
+        <w:t>(14), 49–50. https://doi.org/10.19738/j.cnki.psy.2021.14.020</w:t>
       </w:r>
     </w:p>
     <w:p>
@@ -17381,14 +17473,14 @@
         <w:pStyle w:val="Bibliography"/>
       </w:pPr>
       <w:r>
-        <w:t xml:space="preserve">Gøtzsche, P. C., Hróbjartsson, A., Marić, K., &amp; Tendal, B. (2007). Data Extraction Errors in Meta-analyses That Use Standardized Mean Differences. </w:t>
+        <w:t xml:space="preserve">Cook, R. J., &amp; Sackett, D. L. (1995). The number needed to treat: A clinically useful measure of treatment effect. </w:t>
       </w:r>
       <w:r>
         <w:rPr>
           <w:i/>
           <w:iCs/>
         </w:rPr>
-        <w:t>JAMA</w:t>
+        <w:t>BMJ : British Medical Journal</w:t>
       </w:r>
       <w:r>
         <w:t xml:space="preserve">, </w:t>
@@ -17398,10 +17490,10 @@
           <w:i/>
           <w:iCs/>
         </w:rPr>
-        <w:t>298</w:t>
-      </w:r>
-      <w:r>
-        <w:t>(4), 430–437. https://doi.org/10.1001/jama.298.4.430</w:t>
+        <w:t>310</w:t>
+      </w:r>
+      <w:r>
+        <w:t>(6977), 452–454.</w:t>
       </w:r>
     </w:p>
     <w:p>
@@ -17409,14 +17501,14 @@
         <w:pStyle w:val="Bibliography"/>
       </w:pPr>
       <w:r>
-        <w:t xml:space="preserve">Hayes, L., Boyd, C. P., &amp; Sewell, J. (2011). Acceptance and Commitment Therapy for the Treatment of Adolescent Depression: A Pilot Study in a Psychiatric Outpatient Setting. </w:t>
+        <w:t xml:space="preserve">Gøtzsche, P. C., Hróbjartsson, A., Marić, K., &amp; Tendal, B. (2007). Data Extraction Errors in Meta-analyses That Use Standardized Mean Differences. </w:t>
       </w:r>
       <w:r>
         <w:rPr>
           <w:i/>
           <w:iCs/>
         </w:rPr>
-        <w:t>Mindfulness</w:t>
+        <w:t>JAMA</w:t>
       </w:r>
       <w:r>
         <w:t xml:space="preserve">, </w:t>
@@ -17426,10 +17518,10 @@
           <w:i/>
           <w:iCs/>
         </w:rPr>
-        <w:t>2</w:t>
-      </w:r>
-      <w:r>
-        <w:t>(2), 86–94. https://doi.org/10.1007/s12671-011-0046-5</w:t>
+        <w:t>298</w:t>
+      </w:r>
+      <w:r>
+        <w:t>(4), 430–437. https://doi.org/10.1001/jama.298.4.430</w:t>
       </w:r>
     </w:p>
     <w:p>
@@ -17437,14 +17529,14 @@
         <w:pStyle w:val="Bibliography"/>
       </w:pPr>
       <w:r>
-        <w:t xml:space="preserve">Kadlec, D., Sainani, K. L., &amp; Nimphius, S. (2023). With Great Power Comes Great Responsibility: Common Errors in Meta-Analyses and Meta-Regressions in Strength &amp; Conditioning Research. </w:t>
+        <w:t xml:space="preserve">Hayes, L., Boyd, C. P., &amp; Sewell, J. (2011). Acceptance and Commitment Therapy for the Treatment of Adolescent Depression: A Pilot Study in a Psychiatric Outpatient Setting. </w:t>
       </w:r>
       <w:r>
         <w:rPr>
           <w:i/>
           <w:iCs/>
         </w:rPr>
-        <w:t>Sports Medicine</w:t>
+        <w:t>Mindfulness</w:t>
       </w:r>
       <w:r>
         <w:t xml:space="preserve">, </w:t>
@@ -17454,10 +17546,10 @@
           <w:i/>
           <w:iCs/>
         </w:rPr>
-        <w:t>53</w:t>
-      </w:r>
-      <w:r>
-        <w:t>(2), 313–325. https://doi.org/10.1007/s40279-022-01766-0</w:t>
+        <w:t>2</w:t>
+      </w:r>
+      <w:r>
+        <w:t>(2), 86–94. https://doi.org/10.1007/s12671-011-0046-5</w:t>
       </w:r>
     </w:p>
     <w:p>
@@ -17465,17 +17557,27 @@
         <w:pStyle w:val="Bibliography"/>
       </w:pPr>
       <w:r>
-        <w:t xml:space="preserve">Lakens, D., Page-Gould, E., van Assen, M. A. L. M., Spellman, B., Schönbrodt, F. D., Hasselman, F., Corker, K. S., Grange, J., Sharples, A., Cavender, C., Augusteijn, H., Augusteijn, H., Gerger, H., Locher, C., Miller, I. D., Anvari, F., &amp; Scheel, A. M. (2017). </w:t>
+        <w:t xml:space="preserve">Kadlec, D., Sainani, K. L., &amp; Nimphius, S. (2023). With Great Power Comes Great Responsibility: Common Errors in Meta-Analyses and Meta-Regressions in Strength &amp; Conditioning Research. </w:t>
       </w:r>
       <w:r>
         <w:rPr>
           <w:i/>
           <w:iCs/>
         </w:rPr>
-        <w:t>Examining the Reproducibility of Meta-Analyses in Psychology: A Preliminary Report</w:t>
-      </w:r>
-      <w:r>
-        <w:t xml:space="preserve"> [Preprint]. BITSS. https://doi.org/10.31222/osf.io/xfbjf</w:t>
+        <w:t>Sports Medicine</w:t>
+      </w:r>
+      <w:r>
+        <w:t xml:space="preserve">, </w:t>
+      </w:r>
+      <w:r>
+        <w:rPr>
+          <w:i/>
+          <w:iCs/>
+        </w:rPr>
+        <w:t>53</w:t>
+      </w:r>
+      <w:r>
+        <w:t>(2), 313–325. https://doi.org/10.1007/s40279-022-01766-0</w:t>
       </w:r>
     </w:p>
     <w:p>
@@ -17483,27 +17585,20 @@
         <w:pStyle w:val="Bibliography"/>
       </w:pPr>
       <w:r>
-        <w:t xml:space="preserve">López-Nicolás, R., López-López, J. A., Rubio-Aparicio, M., &amp; Sánchez-Meca, J. (2022). A meta-review of transparency and reproducibility-related reporting practices in published meta-analyses on clinical psychological interventions (2000–2020). </w:t>
+        <w:t xml:space="preserve">Lakens, D., Page-Gould, E., van Assen, M. A. L. M., Spellman, B., Schönbrodt, F. D., Hasselman, F., Corker, K. S., Grange, J., </w:t>
+      </w:r>
+      <w:r>
+        <w:t xml:space="preserve">Sharples, A., Cavender, C., Augusteijn, H., Augusteijn, H., Gerger, H., Locher, C., Miller, I. D., Anvari, F., &amp; Scheel, A. M. (2017). </w:t>
       </w:r>
       <w:r>
         <w:rPr>
           <w:i/>
           <w:iCs/>
         </w:rPr>
-        <w:t>Behavior Research Methods</w:t>
-      </w:r>
-      <w:r>
-        <w:t xml:space="preserve">, </w:t>
-      </w:r>
-      <w:r>
-        <w:rPr>
-          <w:i/>
-          <w:iCs/>
-        </w:rPr>
-        <w:t>54</w:t>
-      </w:r>
-      <w:r>
-        <w:t>(1), 334–349. https://doi.org/10.3758/s13428-021-01644-z</w:t>
+        <w:t>Examining the Reproducibility of Meta-Analyses in Psychology: A Preliminary Report</w:t>
+      </w:r>
+      <w:r>
+        <w:t xml:space="preserve"> [Preprint]. BITSS. https://doi.org/10.31222/osf.io/xfbjf</w:t>
       </w:r>
     </w:p>
     <w:p>
@@ -17511,14 +17606,14 @@
         <w:pStyle w:val="Bibliography"/>
       </w:pPr>
       <w:r>
-        <w:t xml:space="preserve">Maassen, E., Assen, M. A. L. M. van, Nuijten, M. B., Olsson-Collentine, A., &amp; Wicherts, J. M. (2020). Reproducibility of individual effect sizes in meta-analyses in psychology. </w:t>
+        <w:t xml:space="preserve">López-Nicolás, R., López-López, J. A., Rubio-Aparicio, M., &amp; Sánchez-Meca, J. (2022). A meta-review of transparency and reproducibility-related reporting practices in published meta-analyses on clinical psychological interventions (2000–2020). </w:t>
       </w:r>
       <w:r>
         <w:rPr>
           <w:i/>
           <w:iCs/>
         </w:rPr>
-        <w:t>PLOS ONE</w:t>
+        <w:t>Behavior Research Methods</w:t>
       </w:r>
       <w:r>
         <w:t xml:space="preserve">, </w:t>
@@ -17528,10 +17623,10 @@
           <w:i/>
           <w:iCs/>
         </w:rPr>
-        <w:t>15</w:t>
-      </w:r>
-      <w:r>
-        <w:t>(5), e0233107. https://doi.org/10.1371/journal.pone.0233107</w:t>
+        <w:t>54</w:t>
+      </w:r>
+      <w:r>
+        <w:t>(1), 334–349. https://doi.org/10.3758/s13428-021-01644-z</w:t>
       </w:r>
     </w:p>
     <w:p>
@@ -17539,24 +17634,27 @@
         <w:pStyle w:val="Bibliography"/>
       </w:pPr>
       <w:r>
-        <w:t xml:space="preserve">Nuijten, M. B., Hartgerink, C. H. J., van Assen, M. A. L. M., Epskamp, S., &amp; Wicherts, J. M. (2015). The prevalence of statistical reporting errors in psychology (1985–2013). </w:t>
+        <w:t xml:space="preserve">Maassen, E., Assen, M. A. L. M. van, Nuijten, M. B., Olsson-Collentine, A., &amp; Wicherts, J. M. (2020). Reproducibility of individual effect sizes in meta-analyses in psychology. </w:t>
       </w:r>
       <w:r>
         <w:rPr>
           <w:i/>
           <w:iCs/>
         </w:rPr>
-        <w:t xml:space="preserve">Behavior </w:t>
+        <w:t>PLOS ONE</w:t>
+      </w:r>
+      <w:r>
+        <w:t xml:space="preserve">, </w:t>
       </w:r>
       <w:r>
         <w:rPr>
           <w:i/>
           <w:iCs/>
         </w:rPr>
-        <w:t>Research Methods</w:t>
-      </w:r>
-      <w:r>
-        <w:t>. https://doi.org/10.3758/s13428-015-0664-2</w:t>
+        <w:t>15</w:t>
+      </w:r>
+      <w:r>
+        <w:t>(5), e0233107. https://doi.org/10.1371/journal.pone.0233107</w:t>
       </w:r>
     </w:p>
     <w:p>
@@ -17564,27 +17662,17 @@
         <w:pStyle w:val="Bibliography"/>
       </w:pPr>
       <w:r>
-        <w:t xml:space="preserve">Nuijten, M. B., &amp; Polanin, J. R. (2020). “statcheck”: Automatically detect statistical reporting inconsistencies to increase reproducibility of meta‐analyses. </w:t>
+        <w:t xml:space="preserve">Nuijten, M. B., Hartgerink, C. H. J., van Assen, M. A. L. M., Epskamp, S., &amp; Wicherts, J. M. (2015). The prevalence of statistical reporting errors in psychology (1985–2013). </w:t>
       </w:r>
       <w:r>
         <w:rPr>
           <w:i/>
           <w:iCs/>
         </w:rPr>
-        <w:t>Research Synthesis Methods</w:t>
-      </w:r>
-      <w:r>
-        <w:t xml:space="preserve">, </w:t>
-      </w:r>
-      <w:r>
-        <w:rPr>
-          <w:i/>
-          <w:iCs/>
-        </w:rPr>
-        <w:t>11</w:t>
-      </w:r>
-      <w:r>
-        <w:t>(5), 574–579. https://doi.org/10.1002/jrsm.1408</w:t>
+        <w:t>Behavior Research Methods</w:t>
+      </w:r>
+      <w:r>
+        <w:t>. https://doi.org/10.3758/s13428-015-0664-2</w:t>
       </w:r>
     </w:p>
     <w:p>
@@ -17592,17 +17680,27 @@
         <w:pStyle w:val="Bibliography"/>
       </w:pPr>
       <w:r>
-        <w:t xml:space="preserve">Ren, Z. H. (2012). </w:t>
+        <w:t xml:space="preserve">Nuijten, M. B., &amp; Polanin, J. R. (2020). “statcheck”: Automatically detect statistical reporting inconsistencies to increase reproducibility of meta‐analyses. </w:t>
       </w:r>
       <w:r>
         <w:rPr>
           <w:i/>
           <w:iCs/>
         </w:rPr>
-        <w:t>ACT-based computerized treatment for depression: Effects, optimal matching, and mechanisms</w:t>
-      </w:r>
-      <w:r>
-        <w:t>. Central China Normal University.</w:t>
+        <w:t>Research Synthesis Methods</w:t>
+      </w:r>
+      <w:r>
+        <w:t xml:space="preserve">, </w:t>
+      </w:r>
+      <w:r>
+        <w:rPr>
+          <w:i/>
+          <w:iCs/>
+        </w:rPr>
+        <w:t>11</w:t>
+      </w:r>
+      <w:r>
+        <w:t>(5), 574–579. https://doi.org/10.1002/jrsm.1408</w:t>
       </w:r>
     </w:p>
     <w:p>
@@ -17610,27 +17708,17 @@
         <w:pStyle w:val="Bibliography"/>
       </w:pPr>
       <w:r>
-        <w:t xml:space="preserve">Situ, Y. Y. (2022). Effect of acceptance and commitment therapy on adolescent patients with depression. </w:t>
+        <w:t xml:space="preserve">Ren, Z. H. (2012). </w:t>
       </w:r>
       <w:r>
         <w:rPr>
           <w:i/>
           <w:iCs/>
         </w:rPr>
-        <w:t>Chin Foreign Med Res</w:t>
-      </w:r>
-      <w:r>
-        <w:t xml:space="preserve">, </w:t>
-      </w:r>
-      <w:r>
-        <w:rPr>
-          <w:i/>
-          <w:iCs/>
-        </w:rPr>
-        <w:t>20</w:t>
-      </w:r>
-      <w:r>
-        <w:t>(3), 97–100. https://doi.org/10.14033/j.cnki.cfmr.2022.03.026</w:t>
+        <w:t>ACT-based computerized treatment for depression: Effects, optimal matching, and mechanisms</w:t>
+      </w:r>
+      <w:r>
+        <w:t>. Central China Normal University.</w:t>
       </w:r>
     </w:p>
     <w:p>
@@ -17638,17 +17726,27 @@
         <w:pStyle w:val="Bibliography"/>
       </w:pPr>
       <w:r>
-        <w:t xml:space="preserve">The Cochrane Collaboration. (n.d.). </w:t>
+        <w:t xml:space="preserve">Situ, Y. Y. (2022). Effect of acceptance and commitment therapy on adolescent patients with depression. </w:t>
       </w:r>
       <w:r>
         <w:rPr>
           <w:i/>
           <w:iCs/>
         </w:rPr>
-        <w:t>Review Manager (RevMan)</w:t>
-      </w:r>
-      <w:r>
-        <w:t xml:space="preserve"> [Computer software]. revman.cochrane.org</w:t>
+        <w:t>Chin Foreign Med Res</w:t>
+      </w:r>
+      <w:r>
+        <w:t xml:space="preserve">, </w:t>
+      </w:r>
+      <w:r>
+        <w:rPr>
+          <w:i/>
+          <w:iCs/>
+        </w:rPr>
+        <w:t>20</w:t>
+      </w:r>
+      <w:r>
+        <w:t>(3), 97–100. https://doi.org/10.14033/j.cnki.cfmr.2022.03.026</w:t>
       </w:r>
     </w:p>
     <w:p>
@@ -17656,27 +17754,17 @@
         <w:pStyle w:val="Bibliography"/>
       </w:pPr>
       <w:r>
-        <w:t xml:space="preserve">Tolin, D. F., McKay, D., Forman, E. M., Klonsky, E. D., &amp; Thombs, B. D. (2015). Empirically Supported Treatment: Recommendations for a New Model. </w:t>
+        <w:t xml:space="preserve">The Cochrane Collaboration. (n.d.). </w:t>
       </w:r>
       <w:r>
         <w:rPr>
           <w:i/>
           <w:iCs/>
         </w:rPr>
-        <w:t>Clinical Psychology: Science and Practice</w:t>
-      </w:r>
-      <w:r>
-        <w:t xml:space="preserve">, </w:t>
-      </w:r>
-      <w:r>
-        <w:rPr>
-          <w:i/>
-          <w:iCs/>
-        </w:rPr>
-        <w:t>22</w:t>
-      </w:r>
-      <w:r>
-        <w:t>(4), 317–338. https://doi.org/10.1111/cpsp.12122</w:t>
+        <w:t>Review Manager (RevMan)</w:t>
+      </w:r>
+      <w:r>
+        <w:t xml:space="preserve"> [Computer software]. revman.cochrane.org</w:t>
       </w:r>
     </w:p>
     <w:p>
@@ -17684,14 +17772,14 @@
         <w:pStyle w:val="Bibliography"/>
       </w:pPr>
       <w:r>
-        <w:t xml:space="preserve">Viechtbauer, W. (2010). Conducting Meta-Analyses in R with the metafor Package. </w:t>
+        <w:t xml:space="preserve">Tolin, D. F., McKay, D., Forman, E. M., Klonsky, E. D., &amp; Thombs, B. D. (2015). Empirically Supported Treatment: Recommendations for a New Model. </w:t>
       </w:r>
       <w:r>
         <w:rPr>
           <w:i/>
           <w:iCs/>
         </w:rPr>
-        <w:t>Journal of Statistical Software</w:t>
+        <w:t>Clinical Psychology: Science and Practice</w:t>
       </w:r>
       <w:r>
         <w:t xml:space="preserve">, </w:t>
@@ -17701,10 +17789,10 @@
           <w:i/>
           <w:iCs/>
         </w:rPr>
-        <w:t>36</w:t>
-      </w:r>
-      <w:r>
-        <w:t>(3). https://doi.org/10.18637/jss.v036.i03</w:t>
+        <w:t>22</w:t>
+      </w:r>
+      <w:r>
+        <w:t>(4), 317–338. https://doi.org/10.1111/cpsp.12122</w:t>
       </w:r>
     </w:p>
     <w:p>
@@ -17712,14 +17800,15 @@
         <w:pStyle w:val="Bibliography"/>
       </w:pPr>
       <w:r>
-        <w:t xml:space="preserve">Wang, Y.-P., &amp; Gorenstein, C. (2013). Psychometric properties of the Beck Depression Inventory-II: A comprehensive review. </w:t>
+        <w:lastRenderedPageBreak/>
+        <w:t xml:space="preserve">Viechtbauer, W. (2010). Conducting Meta-Analyses in R with the metafor Package. </w:t>
       </w:r>
       <w:r>
         <w:rPr>
           <w:i/>
           <w:iCs/>
         </w:rPr>
-        <w:t>Revista Brasileira de Psiquiatria</w:t>
+        <w:t>Journal of Statistical Software</w:t>
       </w:r>
       <w:r>
         <w:t xml:space="preserve">, </w:t>
@@ -17729,10 +17818,10 @@
           <w:i/>
           <w:iCs/>
         </w:rPr>
-        <w:t>35</w:t>
-      </w:r>
-      <w:r>
-        <w:t>(4), 416–431. https://doi.org/10.1590/1516-4446-2012-1048</w:t>
+        <w:t>36</w:t>
+      </w:r>
+      <w:r>
+        <w:t>(3). https://doi.org/10.18637/jss.v036.i03</w:t>
       </w:r>
     </w:p>
     <w:p>
@@ -17740,17 +17829,27 @@
         <w:pStyle w:val="Bibliography"/>
       </w:pPr>
       <w:r>
-        <w:t xml:space="preserve">Wilkinson, J., Heal, C., Antoniou, G. A., Alfirevic, Z., Avenell, A., Barbour, V., Brown, N. J. L., Carlisle, J., Dicker, P., Dumville, J., Grey, A., Gurrin, L. C., Hayden, J. A., Heathers, J., Hunter, K. E., Lasserson, T., Lam, E., Lensen, S., Li, T., … Kirkham, J. J. (2023). </w:t>
+        <w:t xml:space="preserve">Wang, Y.-P., &amp; Gorenstein, C. (2013). Psychometric properties of the Beck Depression Inventory-II: A comprehensive review. </w:t>
       </w:r>
       <w:r>
         <w:rPr>
           <w:i/>
           <w:iCs/>
         </w:rPr>
-        <w:t>Protocol for the development of a tool (INSPECT-SR) to identify problematic randomised controlled trials in systematic reviews of health interventions</w:t>
-      </w:r>
-      <w:r>
-        <w:t xml:space="preserve"> (p. 2023.09.21.23295626). medRxiv. https://doi.org/10.1101/2023.09.21.23295626</w:t>
+        <w:t>Revista Brasileira de Psiquiatria</w:t>
+      </w:r>
+      <w:r>
+        <w:t xml:space="preserve">, </w:t>
+      </w:r>
+      <w:r>
+        <w:rPr>
+          <w:i/>
+          <w:iCs/>
+        </w:rPr>
+        <w:t>35</w:t>
+      </w:r>
+      <w:r>
+        <w:t>(4), 416–431. https://doi.org/10.1590/1516-4446-2012-1048</w:t>
       </w:r>
     </w:p>
     <w:p>
@@ -17758,11 +17857,25 @@
         <w:pStyle w:val="Bibliography"/>
       </w:pPr>
       <w:r>
-        <w:t xml:space="preserve">Zemestani, M., &amp; Mozaffari, S. (2020). Acceptance and commitment therapy for the treatment of depression in persons with </w:t>
-      </w:r>
-      <w:r>
-        <w:lastRenderedPageBreak/>
-        <w:t xml:space="preserve">physical disability: A randomized controlled trial. </w:t>
+        <w:t xml:space="preserve">Wilkinson, J., Heal, C., Antoniou, G. A., Alfirevic, Z., Avenell, A., Barbour, V., Brown, N. J. L., Carlisle, J., Dicker, P., Dumville, J., Grey, A., Gurrin, L. C., Hayden, J. A., Heathers, J., Hunter, K. E., Lasserson, T., Lam, E., Lensen, S., Li, T., … Kirkham, J. J. (2023). </w:t>
+      </w:r>
+      <w:r>
+        <w:rPr>
+          <w:i/>
+          <w:iCs/>
+        </w:rPr>
+        <w:t>Protocol for the development of a tool (INSPECT-SR) to identify problematic randomised controlled trials in systematic reviews of health interventions</w:t>
+      </w:r>
+      <w:r>
+        <w:t xml:space="preserve"> (p. 2023.09.21.23295626). medRxiv. https://doi.org/10.1101/2023.09.21.23295626</w:t>
+      </w:r>
+    </w:p>
+    <w:p>
+      <w:pPr>
+        <w:pStyle w:val="Bibliography"/>
+      </w:pPr>
+      <w:r>
+        <w:t xml:space="preserve">Zemestani, M., &amp; Mozaffari, S. (2020). Acceptance and commitment therapy for the treatment of depression in persons with physical disability: A randomized controlled trial. </w:t>
       </w:r>
       <w:r>
         <w:rPr>
@@ -19073,6 +19186,55 @@
       <w:szCs w:val="20"/>
     </w:rPr>
   </w:style>
+  <w:style w:type="paragraph" w:styleId="HTMLPreformatted">
+    <w:name w:val="HTML Preformatted"/>
+    <w:basedOn w:val="Normal"/>
+    <w:link w:val="HTMLPreformattedChar"/>
+    <w:uiPriority w:val="99"/>
+    <w:semiHidden/>
+    <w:unhideWhenUsed/>
+    <w:rsid w:val="00A14148"/>
+    <w:pPr>
+      <w:tabs>
+        <w:tab w:val="left" w:pos="916"/>
+        <w:tab w:val="left" w:pos="1832"/>
+        <w:tab w:val="left" w:pos="2748"/>
+        <w:tab w:val="left" w:pos="3664"/>
+        <w:tab w:val="left" w:pos="4580"/>
+        <w:tab w:val="left" w:pos="5496"/>
+        <w:tab w:val="left" w:pos="6412"/>
+        <w:tab w:val="left" w:pos="7328"/>
+        <w:tab w:val="left" w:pos="8244"/>
+        <w:tab w:val="left" w:pos="9160"/>
+        <w:tab w:val="left" w:pos="10076"/>
+        <w:tab w:val="left" w:pos="10992"/>
+        <w:tab w:val="left" w:pos="11908"/>
+        <w:tab w:val="left" w:pos="12824"/>
+        <w:tab w:val="left" w:pos="13740"/>
+        <w:tab w:val="left" w:pos="14656"/>
+      </w:tabs>
+      <w:ind w:firstLine="0"/>
+      <w:jc w:val="left"/>
+    </w:pPr>
+    <w:rPr>
+      <w:rFonts w:ascii="Courier New" w:hAnsi="Courier New" w:cs="Courier New"/>
+      <w:lang w:val="en-CH"/>
+    </w:rPr>
+  </w:style>
+  <w:style w:type="character" w:customStyle="1" w:styleId="HTMLPreformattedChar">
+    <w:name w:val="HTML Preformatted Char"/>
+    <w:basedOn w:val="DefaultParagraphFont"/>
+    <w:link w:val="HTMLPreformatted"/>
+    <w:uiPriority w:val="99"/>
+    <w:semiHidden/>
+    <w:rsid w:val="00A14148"/>
+    <w:rPr>
+      <w:rFonts w:ascii="Courier New" w:hAnsi="Courier New" w:cs="Courier New"/>
+      <w:sz w:val="20"/>
+      <w:szCs w:val="20"/>
+      <w:lang w:val="en-CH"/>
+    </w:rPr>
+  </w:style>
 </w:styles>
 </file>
 

</xml_diff>